<commit_message>
Refine ENGL 1102 Unit 4 references: full Serdikoff initials, APA article numbers for Computers articles
</commit_message>
<xml_diff>
--- a/Term_02/ENGL 1102-01 English Composition 2 - AY2027-T1/Assignments/Unit4_Assignment.docx
+++ b/Term_02/ENGL 1102-01 English Composition 2 - AY2027-T1/Assignments/Unit4_Assignment.docx
@@ -405,7 +405,7 @@
           <w:i w:val="0"/>
           <w:sz w:val="24"/>
         </w:rPr>
-        <w:t xml:space="preserve">(5), 185. </w:t>
+        <w:t xml:space="preserve">(5), Article 185. </w:t>
       </w:r>
       <w:hyperlink r:id="rId9">
         <w:r>
@@ -509,7 +509,7 @@
           <w:i w:val="0"/>
           <w:sz w:val="24"/>
         </w:rPr>
-        <w:t xml:space="preserve">(3), 154. </w:t>
+        <w:t xml:space="preserve">(3), Article 154. </w:t>
       </w:r>
       <w:hyperlink r:id="rId11">
         <w:r>
@@ -810,7 +810,7 @@
           <w:i w:val="0"/>
           <w:sz w:val="24"/>
         </w:rPr>
-        <w:t xml:space="preserve">Serdikoff, S. (2021). </w:t>
+        <w:t xml:space="preserve">Serdikoff, S. L. (2021). </w:t>
       </w:r>
       <w:r>
         <w:rPr>

</xml_diff>